<commit_message>
fix(docx): join paragraphs across empty markers; review follow-ups
- revisions accept/reject: a break that goes away now joins its paragraph
  with the next one across empty bookmark, comment-range, move-range and
  permission markers, which Word writes between paragraphs. A table still
  stops the join.
- synthesize.py: a paragraph holding a comment is no longer cut, which left
  all.fodt with a comment end and no start. all.* regenerated.
- Docs: a document reads the same under all three choices only with no
  tracked changes and no comments.

Co-Authored-By: Claude Opus 5.5 <noreply@anthropic.com>
Claude-Session: https://claude.ai/code/session_01KLAQnEaoCre2CSmUughCut
</commit_message>
<xml_diff>
--- a/crates/anymd-formats/tests/fixtures/critic/synthetic/all.accepted.docx
+++ b/crates/anymd-formats/tests/fixtures/critic/synthetic/all.accepted.docx
@@ -655,7 +655,30 @@
       </w:pPr>
       <w:r>
         <w:rPr/>
-        <w:t>The warranty on a business day period is twelve months from delivery.</w:t>
+        <w:t>Neither party is liable</w:t>
+      </w:r>
+      <w:commentRangeStart w:id="18"/>
+      <w:r>
+        <w:rPr/>
+        <w:t xml:space="preserve"> for</w:t>
+      </w:r>
+      <w:r>
+        <w:rPr/>
+      </w:r>
+      <w:commentRangeEnd w:id="18"/>
+      <w:r>
+        <w:commentReference w:id="18"/>
+      </w:r>
+      <w:r>
+        <w:rPr/>
+        <w:t xml:space="preserve"> delays by events beyond its control.</w:t>
+      </w:r>
+      <w:commentRangeStart w:id="19"/>
+      <w:r>
+        <w:rPr>
+          <w:rStyle w:val="FootnoteReference"/>
+        </w:rPr>
+        <w:footnoteReference w:id="2"/>
       </w:r>
     </w:p>
     <w:p>
@@ -667,7 +690,14 @@
       </w:pPr>
       <w:r>
         <w:rPr/>
-        <w:t xml:space="preserve">Either party may this agreement with ninety days </w:t>
+      </w:r>
+      <w:commentRangeEnd w:id="19"/>
+      <w:r>
+        <w:commentReference w:id="19"/>
+      </w:r>
+      <w:r>
+        <w:rPr/>
+        <w:t>The warranty period is twelve months from without undue delay delivery.</w:t>
       </w:r>
     </w:p>
     <w:p>
@@ -679,23 +709,49 @@
       </w:pPr>
       <w:r>
         <w:rPr/>
-        <w:t>written notice. The supplier may as reasonably required</w:t>
-      </w:r>
-      <w:commentRangeStart w:id="18"/>
-      <w:r>
-        <w:rPr/>
-        <w:t xml:space="preserve"> subcontract only with</w:t>
-      </w:r>
-      <w:r>
-        <w:rPr/>
-      </w:r>
-      <w:commentRangeEnd w:id="18"/>
-      <w:r>
-        <w:commentReference w:id="18"/>
-      </w:r>
-      <w:r>
-        <w:rPr/>
-        <w:t xml:space="preserve"> the buyer's prior.</w:t>
+        <w:t>Either party may</w:t>
+      </w:r>
+      <w:commentRangeStart w:id="20"/>
+      <w:r>
+        <w:rPr/>
+        <w:t xml:space="preserve"> agreement customer</w:t>
+      </w:r>
+      <w:r>
+        <w:rPr/>
+      </w:r>
+      <w:commentRangeEnd w:id="20"/>
+      <w:r>
+        <w:commentReference w:id="20"/>
+      </w:r>
+      <w:r>
+        <w:rPr/>
+        <w:t xml:space="preserve"> ninety written unless agreed otherwise notice. The supplier may subcontract only with the buyer's</w:t>
+      </w:r>
+      <w:commentRangeStart w:id="21"/>
+      <w:r>
+        <w:rPr/>
+        <w:t xml:space="preserve"> prior </w:t>
+      </w:r>
+      <w:r>
+        <w:rPr>
+          <w:b/>
+        </w:rPr>
+        <w:t>consent</w:t>
+      </w:r>
+      <w:r>
+        <w:rPr/>
+        <w:t>.</w:t>
+      </w:r>
+      <w:r>
+        <w:rPr/>
+      </w:r>
+      <w:commentRangeEnd w:id="21"/>
+      <w:r>
+        <w:commentReference w:id="21"/>
+      </w:r>
+      <w:r>
+        <w:rPr/>
+        <w:commentReference w:id="22"/>
       </w:r>
     </w:p>
     <w:p>
@@ -707,252 +763,281 @@
       </w:pPr>
       <w:r>
         <w:rPr/>
-        <w:t>The buyer may inspect the goods</w:t>
-      </w:r>
-      <w:commentRangeStart w:id="19"/>
+        <w:t xml:space="preserve">The </w:t>
+      </w:r>
+    </w:p>
+    <w:p>
+      <w:pPr>
+        <w:pStyle w:val="Normal"/>
+        <w:bidi w:val="0"/>
+        <w:jc w:val="left"/>
+        <w:rPr/>
+      </w:pPr>
+      <w:r>
+        <w:rPr/>
+        <w:t>buyer may supplier</w:t>
+      </w:r>
+      <w:commentRangeStart w:id="23"/>
+      <w:r>
+        <w:rPr/>
+        <w:t xml:space="preserve"> the</w:t>
+      </w:r>
+      <w:r>
+        <w:rPr/>
+      </w:r>
+      <w:commentRangeEnd w:id="23"/>
+      <w:r>
+        <w:commentReference w:id="23"/>
+      </w:r>
+      <w:r>
+        <w:rPr/>
+        <w:t xml:space="preserve"> goods before accepting at its own cost them unless agreed otherwise.</w:t>
+      </w:r>
+      <w:r>
+        <w:rPr/>
+        <w:commentReference w:id="24"/>
+      </w:r>
+    </w:p>
+    <w:p>
+      <w:pPr>
+        <w:pStyle w:val="Normal"/>
+        <w:bidi w:val="0"/>
+        <w:jc w:val="left"/>
+        <w:rPr/>
+      </w:pPr>
+      <w:r>
+        <w:rPr/>
+        <w:t>The supplier at its own cost</w:t>
+      </w:r>
+      <w:commentRangeStart w:id="25"/>
+      <w:r>
+        <w:rPr/>
+        <w:t xml:space="preserve"> may subcontract only </w:t>
+      </w:r>
+      <w:r>
+        <w:rPr>
+          <w:i/>
+        </w:rPr>
+        <w:t>with</w:t>
+      </w:r>
+      <w:r>
+        <w:rPr/>
+      </w:r>
+      <w:commentRangeEnd w:id="25"/>
+      <w:r>
+        <w:commentReference w:id="25"/>
+      </w:r>
+      <w:r>
+        <w:rPr/>
+        <w:t xml:space="preserve"> the buyer's prior in good faith consent.</w:t>
+      </w:r>
+    </w:p>
+    <w:p>
+      <w:pPr>
+        <w:pStyle w:val="Normal"/>
+        <w:bidi w:val="0"/>
+        <w:jc w:val="left"/>
+        <w:rPr/>
+      </w:pPr>
+      <w:r>
+        <w:rPr>
+          <w:i/>
+        </w:rPr>
+        <w:t>The</w:t>
+      </w:r>
+      <w:r>
+        <w:rPr/>
+        <w:t xml:space="preserve"> price includes packaging but</w:t>
+      </w:r>
+      <w:commentRangeStart w:id="26"/>
+      <w:r>
+        <w:rPr/>
+        <w:t xml:space="preserve"> excludes</w:t>
+      </w:r>
+      <w:r>
+        <w:rPr/>
+      </w:r>
+      <w:commentRangeEnd w:id="26"/>
+      <w:r>
+        <w:commentReference w:id="26"/>
+      </w:r>
+      <w:r>
+        <w:rPr/>
+        <w:t xml:space="preserve"> shipping and taxes.</w:t>
+      </w:r>
+      <w:r>
+        <w:rPr/>
+        <w:commentReference w:id="27"/>
+      </w:r>
+    </w:p>
+    <w:p>
+      <w:pPr>
+        <w:pStyle w:val="Normal"/>
+        <w:bidi w:val="0"/>
+        <w:jc w:val="left"/>
+        <w:rPr/>
+      </w:pPr>
+      <w:r>
+        <w:rPr/>
+        <w:t xml:space="preserve">Notices </w:t>
+      </w:r>
+      <w:r>
+        <w:rPr>
+          <w:b/>
+        </w:rPr>
+        <w:t>must</w:t>
+      </w:r>
+      <w:commentRangeStart w:id="28"/>
+      <w:r>
+        <w:rPr/>
+        <w:t xml:space="preserve"> be by</w:t>
+      </w:r>
+      <w:r>
+        <w:rPr/>
+      </w:r>
+      <w:commentRangeEnd w:id="28"/>
+      <w:r>
+        <w:commentReference w:id="28"/>
+      </w:r>
+      <w:r>
+        <w:rPr/>
+        <w:t xml:space="preserve"> email promptly by registered mail.</w:t>
+      </w:r>
+    </w:p>
+    <w:p>
+      <w:pPr>
+        <w:pStyle w:val="Normal"/>
+        <w:bidi w:val="0"/>
+        <w:jc w:val="left"/>
+        <w:rPr/>
+      </w:pPr>
+      <w:r>
+        <w:rPr/>
+        <w:t>The warranty period is twelve months from delivery.</w:t>
+      </w:r>
+    </w:p>
+    <w:p>
+      <w:pPr>
+        <w:pStyle w:val="Normal"/>
+        <w:bidi w:val="0"/>
+        <w:jc w:val="left"/>
+        <w:rPr/>
+      </w:pPr>
+      <w:r>
+        <w:rPr>
+          <w:b/>
+        </w:rPr>
+        <w:t>Late</w:t>
+      </w:r>
+      <w:r>
+        <w:rPr/>
+        <w:t xml:space="preserve"> payments carry interest at </w:t>
+      </w:r>
+    </w:p>
+    <w:p>
+      <w:pPr>
+        <w:pStyle w:val="Normal"/>
+        <w:bidi w:val="0"/>
+        <w:jc w:val="left"/>
+        <w:rPr/>
+      </w:pPr>
+      <w:r>
+        <w:rPr/>
+        <w:t xml:space="preserve">the statutory </w:t>
+      </w:r>
+      <w:r>
+        <w:rPr>
+          <w:i/>
+        </w:rPr>
+        <w:t>rate</w:t>
+      </w:r>
+      <w:r>
+        <w:rPr/>
+        <w:t>.</w:t>
+      </w:r>
+    </w:p>
+    <w:p>
+      <w:pPr>
+        <w:pStyle w:val="Normal"/>
+        <w:bidi w:val="0"/>
+        <w:jc w:val="left"/>
+        <w:rPr/>
+      </w:pPr>
       <w:r>
         <w:rPr/>
         <w:t xml:space="preserve"> </w:t>
       </w:r>
       <w:r>
+        <w:rPr/>
+        <w:t xml:space="preserve">to this agreement must be in writing </w:t>
+      </w:r>
+      <w:r>
+        <w:rPr>
+          <w:i/>
+        </w:rPr>
+        <w:t>and</w:t>
+      </w:r>
+      <w:r>
+        <w:rPr/>
+        <w:t xml:space="preserve"> signed by both parties.</w:t>
+      </w:r>
+    </w:p>
+    <w:p>
+      <w:pPr>
+        <w:pStyle w:val="Normal"/>
+        <w:bidi w:val="0"/>
+        <w:jc w:val="left"/>
+        <w:rPr/>
+      </w:pPr>
+      <w:r>
         <w:rPr>
           <w:b/>
         </w:rPr>
-        <w:t>before</w:t>
-      </w:r>
-      <w:r>
-        <w:rPr/>
-      </w:r>
-      <w:commentRangeEnd w:id="19"/>
-      <w:r>
-        <w:commentReference w:id="19"/>
+        <w:t>This</w:t>
+      </w:r>
+      <w:r>
+        <w:rPr/>
+        <w:t xml:space="preserve"> agreement is governed by the </w:t>
+      </w:r>
+      <w:r>
+        <w:rPr>
+          <w:b/>
+        </w:rPr>
+        <w:t>laws</w:t>
       </w:r>
       <w:r>
         <w:rPr/>
         <w:t xml:space="preserve"> </w:t>
       </w:r>
-    </w:p>
-    <w:p>
-      <w:pPr>
-        <w:pStyle w:val="Normal"/>
-        <w:bidi w:val="0"/>
-        <w:jc w:val="left"/>
-        <w:rPr/>
-      </w:pPr>
       <w:r>
         <w:rPr>
           <w:i/>
         </w:rPr>
-        <w:t>accepting</w:t>
-      </w:r>
-      <w:r>
-        <w:rPr/>
-        <w:t xml:space="preserve"> them.</w:t>
-      </w:r>
-    </w:p>
-    <w:p>
-      <w:pPr>
-        <w:pStyle w:val="Normal"/>
-        <w:bidi w:val="0"/>
-        <w:jc w:val="left"/>
-        <w:rPr/>
-      </w:pPr>
-      <w:r>
-        <w:rPr/>
-        <w:t xml:space="preserve">The </w:t>
-      </w:r>
-      <w:r>
-        <w:rPr>
-          <w:b/>
-        </w:rPr>
-        <w:t>supplier</w:t>
-      </w:r>
-      <w:r>
-        <w:rPr/>
-        <w:t xml:space="preserve"> may subcontract only the unless agreed otherwise</w:t>
-      </w:r>
-      <w:r>
-        <w:rPr/>
-        <w:t xml:space="preserve"> prior consent.</w:t>
-      </w:r>
-      <w:r>
-        <w:rPr/>
-        <w:commentReference w:id="20"/>
-      </w:r>
-    </w:p>
-    <w:p>
-      <w:pPr>
-        <w:pStyle w:val="Normal"/>
-        <w:bidi w:val="0"/>
-        <w:jc w:val="left"/>
-        <w:rPr/>
-      </w:pPr>
-      <w:r>
-        <w:rPr/>
-        <w:t>The price</w:t>
-      </w:r>
-      <w:commentRangeStart w:id="21"/>
-      <w:r>
-        <w:rPr/>
-        <w:t xml:space="preserve"> includes packaging but unless agreed otherwise excludes</w:t>
-      </w:r>
-      <w:r>
-        <w:rPr/>
-      </w:r>
-      <w:commentRangeEnd w:id="21"/>
-      <w:r>
-        <w:commentReference w:id="21"/>
-      </w:r>
-      <w:r>
-        <w:rPr/>
-        <w:t xml:space="preserve"> shipping taxes.</w:t>
-      </w:r>
-    </w:p>
-    <w:p>
-      <w:pPr>
-        <w:pStyle w:val="Normal"/>
-        <w:bidi w:val="0"/>
-        <w:jc w:val="left"/>
-        <w:rPr/>
-      </w:pPr>
+        <w:t>of</w:t>
+      </w:r>
+      <w:r>
+        <w:rPr/>
+        <w:t xml:space="preserve"> the </w:t>
+      </w:r>
       <w:r>
         <w:rPr>
           <w:i/>
         </w:rPr>
-        <w:t>Notices</w:t>
-      </w:r>
-      <w:r>
-        <w:rPr/>
-        <w:t xml:space="preserve"> must be sent by email </w:t>
-      </w:r>
-    </w:p>
-    <w:p>
-      <w:pPr>
-        <w:pStyle w:val="Normal"/>
-        <w:bidi w:val="0"/>
-        <w:jc w:val="left"/>
-        <w:rPr/>
-      </w:pPr>
-      <w:r>
-        <w:rPr/>
-        <w:t>and by registered mail.</w:t>
-      </w:r>
-      <w:r>
-        <w:rPr/>
-        <w:commentReference w:id="22"/>
-      </w:r>
-    </w:p>
-    <w:p>
-      <w:pPr>
-        <w:pStyle w:val="Normal"/>
-        <w:bidi w:val="0"/>
-        <w:jc w:val="left"/>
-        <w:rPr/>
-      </w:pPr>
-      <w:r>
-        <w:rPr/>
-        <w:t>Late payments</w:t>
-      </w:r>
-      <w:commentRangeStart w:id="23"/>
-      <w:r>
-        <w:rPr/>
-        <w:t xml:space="preserve"> interest</w:t>
-      </w:r>
-      <w:r>
-        <w:rPr/>
-      </w:r>
-      <w:commentRangeEnd w:id="23"/>
-      <w:r>
-        <w:commentReference w:id="23"/>
-      </w:r>
-      <w:r>
-        <w:rPr/>
-        <w:t xml:space="preserve"> at promptly statutory rate.</w:t>
-      </w:r>
-    </w:p>
-    <w:p>
-      <w:pPr>
-        <w:pStyle w:val="Normal"/>
-        <w:bidi w:val="0"/>
-        <w:jc w:val="left"/>
-        <w:rPr/>
-      </w:pPr>
-      <w:r>
-        <w:rPr/>
-        <w:t xml:space="preserve">Any change </w:t>
-      </w:r>
-      <w:r>
-        <w:rPr>
-          <w:b/>
-        </w:rPr>
-        <w:t>to</w:t>
-      </w:r>
-      <w:r>
-        <w:rPr/>
-        <w:t xml:space="preserve"> this agreement </w:t>
-      </w:r>
-    </w:p>
-    <w:p>
-      <w:pPr>
-        <w:pStyle w:val="Normal"/>
-        <w:bidi w:val="0"/>
-        <w:jc w:val="left"/>
-        <w:rPr/>
-      </w:pPr>
-      <w:r>
-        <w:rPr/>
-        <w:t xml:space="preserve">must be in writing </w:t>
-      </w:r>
-      <w:r>
-        <w:rPr>
-          <w:i/>
-        </w:rPr>
-        <w:t>and</w:t>
-      </w:r>
-      <w:r>
-        <w:rPr/>
-        <w:t xml:space="preserve"> by both.</w:t>
-      </w:r>
-    </w:p>
-    <w:p>
-      <w:pPr>
-        <w:pStyle w:val="Normal"/>
-        <w:bidi w:val="0"/>
-        <w:jc w:val="left"/>
-        <w:rPr/>
-      </w:pPr>
-      <w:r>
-        <w:rPr/>
-        <w:t>This agreement</w:t>
-      </w:r>
-      <w:commentRangeStart w:id="24"/>
-      <w:r>
-        <w:rPr/>
-        <w:t xml:space="preserve"> is governed by</w:t>
-      </w:r>
-      <w:r>
-        <w:rPr/>
-      </w:r>
-      <w:commentRangeEnd w:id="24"/>
-      <w:r>
-        <w:commentReference w:id="24"/>
-      </w:r>
-      <w:r>
-        <w:rPr/>
-        <w:t xml:space="preserve"> </w:t>
-      </w:r>
-      <w:r>
-        <w:rPr>
-          <w:i/>
-        </w:rPr>
-        <w:t>the</w:t>
-      </w:r>
-      <w:r>
-        <w:rPr/>
-        <w:t xml:space="preserve"> laws of the State of New York at its own cost.</w:t>
+        <w:t>State</w:t>
+      </w:r>
+      <w:r>
+        <w:rPr/>
+        <w:t xml:space="preserve"> of New notice.</w:t>
+      </w:r>
+      <w:r>
+        <w:rPr/>
+        <w:commentReference w:id="29"/>
       </w:r>
     </w:p>
     <w:sectPr>
+      <w:footnotePr>
+        <w:numFmt w:val="decimal"/>
+      </w:footnotePr>
       <w:type w:val="nextPage"/>
       <w:pgSz w:w="11906" w:h="16838"/>
       <w:pgMar w:left="1134" w:right="1134" w:gutter="0" w:header="0" w:top="1134" w:footer="0" w:bottom="1134"/>
@@ -1272,7 +1357,41 @@
       </w:r>
     </w:p>
   </w:comment>
-  <w:comment w:id="18" w:author="Ana Lima" w:date="2026-09-01T07:35:00Z" w:initials="">
+  <w:comment w:id="18" w:author="Ana Lima" w:date="2026-09-01T06:32:00Z" w:initials="">
+    <w:p>
+      <w:pPr>
+        <w:overflowPunct w:val="false"/>
+        <w:bidi w:val="0"/>
+        <w:rPr/>
+      </w:pPr>
+      <w:r>
+        <w:rPr>
+          <w:rFonts w:eastAsia="DejaVu Sans" w:cs="DejaVu Sans"/>
+          <w:kern w:val="0"/>
+          <w:lang w:val="en-US" w:eastAsia="en-US" w:bidi="en-US"/>
+        </w:rPr>
+        <w:t>Is this consistent with the master agreement?</w:t>
+      </w:r>
+    </w:p>
+  </w:comment>
+  <w:comment w:id="19" w:author="Bo Chen" w:date="2026-09-01T06:39:00Z" w:initials="">
+    <w:p>
+      <w:pPr>
+        <w:overflowPunct w:val="false"/>
+        <w:bidi w:val="0"/>
+        <w:rPr/>
+      </w:pPr>
+      <w:r>
+        <w:rPr>
+          <w:rFonts w:eastAsia="DejaVu Sans" w:cs="DejaVu Sans"/>
+          <w:kern w:val="0"/>
+          <w:lang w:val="en-US" w:eastAsia="en-US" w:bidi="en-US"/>
+        </w:rPr>
+        <w:t>Legal to review.</w:t>
+      </w:r>
+    </w:p>
+  </w:comment>
+  <w:comment w:id="20" w:author="Carla Duarte" w:date="2026-09-01T07:42:00Z" w:initials="">
     <w:p>
       <w:pPr>
         <w:overflowPunct w:val="false"/>
@@ -1289,7 +1408,126 @@
       </w:r>
     </w:p>
   </w:comment>
-  <w:comment w:id="19" w:author="Bo Chen" w:date="2026-09-01T07:49:00Z" w:initials="">
+  <w:comment w:id="21" w:author="Carla Duarte" w:date="2026-09-01T07:56:00Z" w:initials="">
+    <w:p>
+      <w:pPr>
+        <w:overflowPunct w:val="false"/>
+        <w:bidi w:val="0"/>
+        <w:rPr/>
+      </w:pPr>
+      <w:r>
+        <w:rPr>
+          <w:rFonts w:eastAsia="DejaVu Sans" w:cs="DejaVu Sans"/>
+          <w:kern w:val="0"/>
+          <w:lang w:val="en-US" w:eastAsia="en-US" w:bidi="en-US"/>
+        </w:rPr>
+        <w:t>Why thirty and not sixty?</w:t>
+      </w:r>
+    </w:p>
+  </w:comment>
+  <w:comment w:id="22" w:author="Ana Lima" w:date="2026-09-01T08:03:00Z" w:initials="">
+    <w:p>
+      <w:pPr>
+        <w:overflowPunct w:val="false"/>
+        <w:bidi w:val="0"/>
+        <w:rPr/>
+      </w:pPr>
+      <w:r>
+        <w:rPr>
+          <w:rFonts w:eastAsia="DejaVu Sans" w:cs="DejaVu Sans"/>
+          <w:kern w:val="0"/>
+          <w:lang w:val="en-US" w:eastAsia="en-US" w:bidi="en-US"/>
+        </w:rPr>
+        <w:t>Too broad, narrow it down.</w:t>
+      </w:r>
+    </w:p>
+  </w:comment>
+  <w:comment w:id="23" w:author="Ana Lima" w:date="2026-09-01T08:45:00Z" w:initials="">
+    <w:p>
+      <w:pPr>
+        <w:overflowPunct w:val="false"/>
+        <w:bidi w:val="0"/>
+        <w:rPr/>
+      </w:pPr>
+      <w:r>
+        <w:rPr>
+          <w:rFonts w:eastAsia="DejaVu Sans" w:cs="DejaVu Sans"/>
+          <w:kern w:val="0"/>
+          <w:lang w:val="en-US" w:eastAsia="en-US" w:bidi="en-US"/>
+        </w:rPr>
+        <w:t>Check the defined term.</w:t>
+      </w:r>
+    </w:p>
+  </w:comment>
+  <w:comment w:id="24" w:author="Bo Chen" w:date="2026-09-01T08:52:00Z" w:initials="">
+    <w:p>
+      <w:pPr>
+        <w:overflowPunct w:val="false"/>
+        <w:bidi w:val="0"/>
+        <w:rPr/>
+      </w:pPr>
+      <w:r>
+        <w:rPr>
+          <w:rFonts w:eastAsia="DejaVu Sans" w:cs="DejaVu Sans"/>
+          <w:kern w:val="0"/>
+          <w:lang w:val="en-US" w:eastAsia="en-US" w:bidi="en-US"/>
+        </w:rPr>
+        <w:t>Client asked for this.</w:t>
+      </w:r>
+    </w:p>
+  </w:comment>
+  <w:comment w:id="25" w:author="Ana Lima" w:date="2026-09-01T09:13:00Z" w:initials="">
+    <w:p>
+      <w:pPr>
+        <w:overflowPunct w:val="false"/>
+        <w:bidi w:val="0"/>
+        <w:rPr/>
+      </w:pPr>
+      <w:r>
+        <w:rPr>
+          <w:rFonts w:eastAsia="DejaVu Sans" w:cs="DejaVu Sans"/>
+          <w:kern w:val="0"/>
+          <w:lang w:val="en-US" w:eastAsia="en-US" w:bidi="en-US"/>
+        </w:rPr>
+        <w:t>Client asked for this.</w:t>
+      </w:r>
+    </w:p>
+  </w:comment>
+  <w:comment w:id="26" w:author="Carla Duarte" w:date="2026-09-01T09:20:00Z" w:initials="">
+    <w:p>
+      <w:pPr>
+        <w:overflowPunct w:val="false"/>
+        <w:bidi w:val="0"/>
+        <w:rPr/>
+      </w:pPr>
+      <w:r>
+        <w:rPr>
+          <w:rFonts w:eastAsia="DejaVu Sans" w:cs="DejaVu Sans"/>
+          <w:kern w:val="0"/>
+          <w:lang w:val="en-US" w:eastAsia="en-US" w:bidi="en-US"/>
+        </w:rPr>
+        <w:t>Check the defined term.</w:t>
+      </w:r>
+    </w:p>
+  </w:comment>
+  <w:comment w:id="27" w:author="Ana Lima" w:date="2026-09-01T09:27:00Z" w:initials="">
+    <w:p>
+      <w:pPr>
+        <w:overflowPunct w:val="false"/>
+        <w:bidi w:val="0"/>
+        <w:rPr/>
+      </w:pPr>
+      <w:r>
+        <w:rPr>
+          <w:rFonts w:eastAsia="DejaVu Sans" w:cs="DejaVu Sans"/>
+          <w:kern w:val="0"/>
+          <w:lang w:val="en-US" w:eastAsia="en-US" w:bidi="en-US"/>
+        </w:rPr>
+        <w:t>Please confirm with finance.</w:t>
+      </w:r>
+    </w:p>
+  </w:comment>
+  <w:comment w:id="28" w:author="Bo Chen" w:date="2026-09-01T09:55:00Z" w:initials="">
     <w:p>
       <w:pPr>
         <w:overflowPunct w:val="false"/>
@@ -1306,58 +1544,7 @@
       </w:r>
     </w:p>
   </w:comment>
-  <w:comment w:id="20" w:author="Dev Patel" w:date="2026-09-01T08:17:00Z" w:initials="">
-    <w:p>
-      <w:pPr>
-        <w:overflowPunct w:val="false"/>
-        <w:bidi w:val="0"/>
-        <w:rPr/>
-      </w:pPr>
-      <w:r>
-        <w:rPr>
-          <w:rFonts w:eastAsia="DejaVu Sans" w:cs="DejaVu Sans"/>
-          <w:kern w:val="0"/>
-          <w:lang w:val="en-US" w:eastAsia="en-US" w:bidi="en-US"/>
-        </w:rPr>
-        <w:t>Client asked for this.</w:t>
-      </w:r>
-    </w:p>
-  </w:comment>
-  <w:comment w:id="21" w:author="Ana Lima" w:date="2026-09-01T08:38:00Z" w:initials="">
-    <w:p>
-      <w:pPr>
-        <w:overflowPunct w:val="false"/>
-        <w:bidi w:val="0"/>
-        <w:rPr/>
-      </w:pPr>
-      <w:r>
-        <w:rPr>
-          <w:rFonts w:eastAsia="DejaVu Sans" w:cs="DejaVu Sans"/>
-          <w:kern w:val="0"/>
-          <w:lang w:val="en-US" w:eastAsia="en-US" w:bidi="en-US"/>
-        </w:rPr>
-        <w:t>Client asked for this.</w:t>
-      </w:r>
-    </w:p>
-  </w:comment>
-  <w:comment w:id="22" w:author="Dev Patel" w:date="2026-09-01T08:52:00Z" w:initials="">
-    <w:p>
-      <w:pPr>
-        <w:overflowPunct w:val="false"/>
-        <w:bidi w:val="0"/>
-        <w:rPr/>
-      </w:pPr>
-      <w:r>
-        <w:rPr>
-          <w:rFonts w:eastAsia="DejaVu Sans" w:cs="DejaVu Sans"/>
-          <w:kern w:val="0"/>
-          <w:lang w:val="en-US" w:eastAsia="en-US" w:bidi="en-US"/>
-        </w:rPr>
-        <w:t>Why thirty and not sixty?</w:t>
-      </w:r>
-    </w:p>
-  </w:comment>
-  <w:comment w:id="23" w:author="Bo Chen" w:date="2026-09-01T09:20:00Z" w:initials="">
+  <w:comment w:id="29" w:author="Bo Chen" w:date="2026-09-01T10:51:00Z" w:initials="">
     <w:p>
       <w:pPr>
         <w:overflowPunct w:val="false"/>
@@ -1374,24 +1561,59 @@
       </w:r>
     </w:p>
   </w:comment>
-  <w:comment w:id="24" w:author="Carla Duarte" w:date="2026-09-01T09:55:00Z" w:initials="">
-    <w:p>
-      <w:pPr>
-        <w:overflowPunct w:val="false"/>
-        <w:bidi w:val="0"/>
-        <w:rPr/>
-      </w:pPr>
-      <w:r>
-        <w:rPr>
-          <w:rFonts w:eastAsia="DejaVu Sans" w:cs="DejaVu Sans"/>
-          <w:kern w:val="0"/>
-          <w:lang w:val="en-US" w:eastAsia="en-US" w:bidi="en-US"/>
-        </w:rPr>
-        <w:t>Check the defined term.</w:t>
-      </w:r>
-    </w:p>
-  </w:comment>
 </w:comments>
+</file>
+
+<file path=word/footnotes.xml><?xml version="1.0" encoding="utf-8"?>
+<w:footnotes xmlns:o="urn:schemas-microsoft-com:office:office" xmlns:r="http://schemas.openxmlformats.org/officeDocument/2006/relationships" xmlns:v="urn:schemas-microsoft-com:vml" xmlns:w="http://schemas.openxmlformats.org/wordprocessingml/2006/main" xmlns:w10="urn:schemas-microsoft-com:office:word" xmlns:wp="http://schemas.openxmlformats.org/drawingml/2006/wordprocessingDrawing" xmlns:wps="http://schemas.microsoft.com/office/word/2010/wordprocessingShape" xmlns:wpg="http://schemas.microsoft.com/office/word/2010/wordprocessingGroup" xmlns:mc="http://schemas.openxmlformats.org/markup-compatibility/2006" xmlns:wp14="http://schemas.microsoft.com/office/word/2010/wordprocessingDrawing" xmlns:w14="http://schemas.microsoft.com/office/word/2010/wordml" xmlns:w15="http://schemas.microsoft.com/office/word/2012/wordml" mc:Ignorable="w14 wp14 w15">
+  <w:footnote w:id="0" w:type="separator">
+    <w:p>
+      <w:pPr>
+        <w:rPr>
+          <w:sz w:val="12"/>
+        </w:rPr>
+      </w:pPr>
+      <w:r>
+        <w:separator/>
+      </w:r>
+    </w:p>
+  </w:footnote>
+  <w:footnote w:id="1" w:type="continuationSeparator">
+    <w:p>
+      <w:pPr>
+        <w:rPr>
+          <w:sz w:val="12"/>
+        </w:rPr>
+      </w:pPr>
+      <w:r>
+        <w:continuationSeparator/>
+      </w:r>
+    </w:p>
+  </w:footnote>
+  <w:footnote w:id="2">
+    <w:p>
+      <w:pPr>
+        <w:pStyle w:val="FootnoteText"/>
+        <w:suppressLineNumbers/>
+        <w:bidi w:val="0"/>
+        <w:ind w:hanging="340" w:left="340"/>
+        <w:jc w:val="left"/>
+        <w:rPr/>
+      </w:pPr>
+      <w:r>
+        <w:rPr>
+          <w:rStyle w:val="FootnoteCharacters"/>
+        </w:rPr>
+        <w:footnoteRef/>
+      </w:r>
+      <w:r>
+        <w:rPr/>
+        <w:tab/>
+        <w:t>The buyer on a business day shall return defective goods within fourteen days.</w:t>
+      </w:r>
+    </w:p>
+  </w:footnote>
+</w:footnotes>
 </file>
 
 <file path=word/numbering.xml><?xml version="1.0" encoding="utf-8"?>
@@ -1692,6 +1914,28 @@
       <w:sz w:val="36"/>
       <w:szCs w:val="36"/>
     </w:rPr>
+  </w:style>
+  <w:style w:type="character" w:styleId="FootnoteCharacters">
+    <w:name w:val="Footnote Characters"/>
+    <w:qFormat/>
+    <w:rPr/>
+  </w:style>
+  <w:style w:type="character" w:styleId="FootnoteReference">
+    <w:name w:val="Footnote Reference"/>
+    <w:rPr>
+      <w:vertAlign w:val="superscript"/>
+    </w:rPr>
+  </w:style>
+  <w:style w:type="character" w:styleId="EndnoteReference">
+    <w:name w:val="Endnote Reference"/>
+    <w:rPr>
+      <w:vertAlign w:val="superscript"/>
+    </w:rPr>
+  </w:style>
+  <w:style w:type="character" w:styleId="EndnoteCharacters">
+    <w:name w:val="Endnote Characters"/>
+    <w:qFormat/>
+    <w:rPr/>
   </w:style>
   <w:style w:type="paragraph" w:styleId="Heading">
     <w:name w:val="Heading"/>
@@ -1760,6 +2004,18 @@
       <w:suppressLineNumbers/>
     </w:pPr>
     <w:rPr/>
+  </w:style>
+  <w:style w:type="paragraph" w:styleId="FootnoteText">
+    <w:name w:val="Footnote Text"/>
+    <w:basedOn w:val="Normal"/>
+    <w:pPr>
+      <w:suppressLineNumbers/>
+      <w:ind w:hanging="340" w:left="340"/>
+    </w:pPr>
+    <w:rPr>
+      <w:sz w:val="20"/>
+      <w:szCs w:val="20"/>
+    </w:rPr>
   </w:style>
 </w:styles>
 </file>

</xml_diff>